<commit_message>
Add RCA History, detailed LLM auditing, and collector documentation
- Add searchable RCA History with request details and JSON export
- Allow Administrators and Power Users to view all users’ RCA history
- Restrict Users to their own history
- Display evidence, input arguments, request/run IDs, explanations and retries
- Add execution timeline and per-invocation model/provider usage
- Capture historical LLM settings, durations, errors and reported token usage
- Record evidence compaction, truncation and runner output metadata
- Add additive RCA History database migration
- Fix incorrect redaction of numeric token limits and usage counts
- Default newly registered built-in collectors to AI-Assisted
- Document custom collector discovery, eligibility and keyword matching
- Add custom collector guide link under README User Guides
- Update Web UI guide with RCA History and New Chat confirmation instructions
</commit_message>
<xml_diff>
--- a/Howto_Guides/How_to_Create_Custom_Collectors.docx
+++ b/Howto_Guides/How_to_Create_Custom_Collectors.docx
@@ -5707,6 +5707,383 @@
     </w:p>
     <w:p>
       <w:pPr>
+        <w:pStyle w:val="Heading2"/>
+      </w:pPr>
+      <w:r>
+        <w:t>How discovery works internally</w:t>
+      </w:r>
+    </w:p>
+    <w:p>
+      <w:r>
+        <w:t>Built-in and custom collectors share the same discovery interface, but use different storage. The API Python code builds a combined catalog of eligible collectors. The LLM does not directly query these database tables.</w:t>
+      </w:r>
+    </w:p>
+    <w:tbl>
+      <w:tblPr>
+        <w:tblW w:type="auto" w:w="0"/>
+        <w:tblLayout w:type="fixed"/>
+        <w:tblLook w:firstColumn="1" w:firstRow="1" w:lastColumn="0" w:lastRow="0" w:noHBand="0" w:noVBand="1" w:val="04A0"/>
+        <w:tblBorders>
+          <w:top w:val="single" w:sz="4" w:color="D9D9D9"/>
+          <w:left w:val="single" w:sz="4" w:color="D9D9D9"/>
+          <w:bottom w:val="single" w:sz="4" w:color="D9D9D9"/>
+          <w:right w:val="single" w:sz="4" w:color="D9D9D9"/>
+          <w:insideH w:val="single" w:sz="4" w:color="D9D9D9"/>
+          <w:insideV w:val="single" w:sz="4" w:color="D9D9D9"/>
+        </w:tblBorders>
+      </w:tblPr>
+      <w:tblGrid>
+        <w:gridCol w:w="5112"/>
+        <w:gridCol w:w="5112"/>
+      </w:tblGrid>
+      <w:tr>
+        <w:trPr>
+          <w:tblHeader/>
+        </w:trPr>
+        <w:tc>
+          <w:tcPr>
+            <w:tcW w:type="dxa" w:w="2880"/>
+            <w:vAlign w:val="center"/>
+            <w:shd w:fill="DDE8F1"/>
+            <w:tcMar>
+              <w:top w:w="90" w:type="dxa"/>
+              <w:left w:w="90" w:type="dxa"/>
+              <w:bottom w:w="90" w:type="dxa"/>
+              <w:right w:w="90" w:type="dxa"/>
+            </w:tcMar>
+          </w:tcPr>
+          <w:p>
+            <w:pPr>
+              <w:spacing w:after="60"/>
+            </w:pPr>
+            <w:r>
+              <w:rPr>
+                <w:b/>
+                <w:sz w:val="20"/>
+              </w:rPr>
+              <w:t>Collector type</w:t>
+            </w:r>
+          </w:p>
+        </w:tc>
+        <w:tc>
+          <w:tcPr>
+            <w:tcW w:type="dxa" w:w="7344"/>
+            <w:vAlign w:val="center"/>
+            <w:shd w:fill="DDE8F1"/>
+            <w:tcMar>
+              <w:top w:w="90" w:type="dxa"/>
+              <w:left w:w="90" w:type="dxa"/>
+              <w:bottom w:w="90" w:type="dxa"/>
+              <w:right w:w="90" w:type="dxa"/>
+            </w:tcMar>
+          </w:tcPr>
+          <w:p>
+            <w:pPr>
+              <w:spacing w:after="60"/>
+            </w:pPr>
+            <w:r>
+              <w:rPr>
+                <w:b/>
+                <w:sz w:val="20"/>
+              </w:rPr>
+              <w:t>Storage</w:t>
+            </w:r>
+          </w:p>
+        </w:tc>
+      </w:tr>
+      <w:tr>
+        <w:tc>
+          <w:tcPr>
+            <w:tcW w:type="dxa" w:w="2880"/>
+            <w:vAlign w:val="center"/>
+            <w:shd w:fill="FFFFFF"/>
+            <w:tcMar>
+              <w:top w:w="90" w:type="dxa"/>
+              <w:left w:w="90" w:type="dxa"/>
+              <w:bottom w:w="90" w:type="dxa"/>
+              <w:right w:w="90" w:type="dxa"/>
+            </w:tcMar>
+          </w:tcPr>
+          <w:p>
+            <w:pPr>
+              <w:spacing w:after="60"/>
+            </w:pPr>
+            <w:r>
+              <w:rPr>
+                <w:b w:val="0"/>
+                <w:sz w:val="20"/>
+              </w:rPr>
+              <w:t>Built-in</w:t>
+            </w:r>
+          </w:p>
+        </w:tc>
+        <w:tc>
+          <w:tcPr>
+            <w:tcW w:type="dxa" w:w="7344"/>
+            <w:vAlign w:val="center"/>
+            <w:shd w:fill="FFFFFF"/>
+            <w:tcMar>
+              <w:top w:w="90" w:type="dxa"/>
+              <w:left w:w="90" w:type="dxa"/>
+              <w:bottom w:w="90" w:type="dxa"/>
+              <w:right w:w="90" w:type="dxa"/>
+            </w:tcMar>
+          </w:tcPr>
+          <w:p>
+            <w:pPr>
+              <w:spacing w:after="60"/>
+            </w:pPr>
+            <w:r>
+              <w:rPr>
+                <w:b w:val="0"/>
+                <w:sz w:val="20"/>
+              </w:rPr>
+              <w:t>collector_registry</w:t>
+            </w:r>
+          </w:p>
+        </w:tc>
+      </w:tr>
+      <w:tr>
+        <w:tc>
+          <w:tcPr>
+            <w:tcW w:type="dxa" w:w="2880"/>
+            <w:vAlign w:val="center"/>
+            <w:shd w:fill="FFFFFF"/>
+            <w:tcMar>
+              <w:top w:w="90" w:type="dxa"/>
+              <w:left w:w="90" w:type="dxa"/>
+              <w:bottom w:w="90" w:type="dxa"/>
+              <w:right w:w="90" w:type="dxa"/>
+            </w:tcMar>
+          </w:tcPr>
+          <w:p>
+            <w:pPr>
+              <w:spacing w:after="60"/>
+            </w:pPr>
+            <w:r>
+              <w:rPr>
+                <w:b w:val="0"/>
+                <w:sz w:val="20"/>
+              </w:rPr>
+              <w:t>Custom</w:t>
+            </w:r>
+          </w:p>
+        </w:tc>
+        <w:tc>
+          <w:tcPr>
+            <w:tcW w:type="dxa" w:w="7344"/>
+            <w:vAlign w:val="center"/>
+            <w:shd w:fill="FFFFFF"/>
+            <w:tcMar>
+              <w:top w:w="90" w:type="dxa"/>
+              <w:left w:w="90" w:type="dxa"/>
+              <w:bottom w:w="90" w:type="dxa"/>
+              <w:right w:w="90" w:type="dxa"/>
+            </w:tcMar>
+          </w:tcPr>
+          <w:p>
+            <w:pPr>
+              <w:spacing w:after="60"/>
+            </w:pPr>
+            <w:r>
+              <w:rPr>
+                <w:b w:val="0"/>
+                <w:sz w:val="20"/>
+              </w:rPr>
+              <w:t>tasks and task_artifacts</w:t>
+            </w:r>
+          </w:p>
+        </w:tc>
+      </w:tr>
+    </w:tbl>
+    <w:p/>
+    <w:p>
+      <w:r>
+        <w:t>1. The user asks an operational question.</w:t>
+      </w:r>
+    </w:p>
+    <w:p>
+      <w:r>
+        <w:t>2. The LLM calls list_collectors with search keywords.</w:t>
+      </w:r>
+    </w:p>
+    <w:p>
+      <w:r>
+        <w:t>3. API Python code searches eligible built-in and custom collectors.</w:t>
+      </w:r>
+    </w:p>
+    <w:p>
+      <w:r>
+        <w:t>4. The API returns collector IDs, versions, descriptions, policies and input schemas.</w:t>
+      </w:r>
+    </w:p>
+    <w:p>
+      <w:r>
+        <w:t>5. The LLM requests execute_collector using an exact discovered version and input arguments.</w:t>
+      </w:r>
+    </w:p>
+    <w:p>
+      <w:r>
+        <w:t>6. The API validates inputs, rechecks eligibility and enforces review and execution-policy confirmation.</w:t>
+      </w:r>
+    </w:p>
+    <w:p>
+      <w:r>
+        <w:t>7. The collector returns evidence for the LLM to explain.</w:t>
+      </w:r>
+    </w:p>
+    <w:p>
+      <w:r>
+        <w:t>The shared implementation is catalog() and the discovery/dispatch functions in src/loghawk/api/services/collector_tool_service.py. Web UI RCA and signed-in Hawk Console use this backend flow.</w:t>
+      </w:r>
+    </w:p>
+    <w:p>
+      <w:pPr>
+        <w:pStyle w:val="Heading2"/>
+      </w:pPr>
+      <w:r>
+        <w:t>When a custom collector appears</w:t>
+      </w:r>
+    </w:p>
+    <w:p>
+      <w:pPr>
+        <w:pStyle w:val="ListBullet"/>
+      </w:pPr>
+      <w:r>
+        <w:t>Task kind must be Collector.</w:t>
+      </w:r>
+    </w:p>
+    <w:p>
+      <w:pPr>
+        <w:pStyle w:val="ListBullet"/>
+      </w:pPr>
+      <w:r>
+        <w:t>The latest saved version must be approved and enabled.</w:t>
+      </w:r>
+    </w:p>
+    <w:p>
+      <w:pPr>
+        <w:pStyle w:val="ListBullet"/>
+      </w:pPr>
+      <w:r>
+        <w:t>Execution policy must be AI-Assisted or Auto-Approved.</w:t>
+      </w:r>
+    </w:p>
+    <w:p>
+      <w:pPr>
+        <w:pStyle w:val="ListBullet"/>
+      </w:pPr>
+      <w:r>
+        <w:t>The version must have a valid argument schema.</w:t>
+      </w:r>
+    </w:p>
+    <w:p>
+      <w:pPr>
+        <w:pStyle w:val="ListBullet"/>
+      </w:pPr>
+      <w:r>
+        <w:t>Artifact type must be Python, Bash, PowerShell or Windows CMD.</w:t>
+      </w:r>
+    </w:p>
+    <w:p>
+      <w:r>
+        <w:t>Discovery does not fall back to an older approved version when the latest version is ineligible. An explicit empty-object schema can describe a collector requiring no arguments. Manual and Disabled collectors are not eligible for this AI discovery flow.</w:t>
+      </w:r>
+    </w:p>
+    <w:p>
+      <w:pPr>
+        <w:pStyle w:val="Heading2"/>
+      </w:pPr>
+      <w:r>
+        <w:t>How matching works</w:t>
+      </w:r>
+    </w:p>
+    <w:p>
+      <w:r>
+        <w:t>Discovery matches keywords against collector names and descriptions. It currently does not use LanceDB semantic search or search the script source code. Results are ranked by keyword overlap and paginated within the available context budget. A collector may therefore be on a later page rather than in the first response.</w:t>
+      </w:r>
+    </w:p>
+    <w:p>
+      <w:r>
+        <w:t>Describe the service, supported queries, returned evidence and scope accurately. Include operational terms engineers are likely to use. Only claim capabilities implemented by the collector.</w:t>
+      </w:r>
+    </w:p>
+    <w:p>
+      <w:pPr>
+        <w:pStyle w:val="Heading3"/>
+      </w:pPr>
+      <w:r>
+        <w:t>Example description</w:t>
+      </w:r>
+    </w:p>
+    <w:p>
+      <w:r>
+        <w:t>Runs a bounded, read-only Prometheus instant PromQL query. Retrieves available Kubernetes CPU, memory, pod-status, or monitoring metrics using the supplied query. Does not perform range queries or modify infrastructure.</w:t>
+      </w:r>
+    </w:p>
+    <w:p>
+      <w:pPr>
+        <w:pStyle w:val="Heading2"/>
+      </w:pPr>
+      <w:r>
+        <w:t>Discovery troubleshooting</w:t>
+      </w:r>
+    </w:p>
+    <w:p>
+      <w:pPr>
+        <w:pStyle w:val="ListBullet"/>
+      </w:pPr>
+      <w:r>
+        <w:t>Check that Task kind is Collector, rather than General, Remediation or Rollback.</w:t>
+      </w:r>
+    </w:p>
+    <w:p>
+      <w:pPr>
+        <w:pStyle w:val="ListBullet"/>
+      </w:pPr>
+      <w:r>
+        <w:t>Check approval and enablement on the latest saved version, not just an earlier version.</w:t>
+      </w:r>
+    </w:p>
+    <w:p>
+      <w:pPr>
+        <w:pStyle w:val="ListBullet"/>
+      </w:pPr>
+      <w:r>
+        <w:t>Check that execution policy is AI-Assisted or Auto-Approved.</w:t>
+      </w:r>
+    </w:p>
+    <w:p>
+      <w:pPr>
+        <w:pStyle w:val="ListBullet"/>
+      </w:pPr>
+      <w:r>
+        <w:t>Check that the version has a valid argument schema, including an explicit empty-object schema when no inputs are needed.</w:t>
+      </w:r>
+    </w:p>
+    <w:p>
+      <w:pPr>
+        <w:pStyle w:val="ListBullet"/>
+      </w:pPr>
+      <w:r>
+        <w:t>Use a descriptive name and description with relevant search keywords. Try a broader query or the collector name.</w:t>
+      </w:r>
+    </w:p>
+    <w:p>
+      <w:pPr>
+        <w:pStyle w:val="ListBullet"/>
+      </w:pPr>
+      <w:r>
+        <w:t>Remember that discovery is paginated and constrained by the model context budget.</w:t>
+      </w:r>
+    </w:p>
+    <w:p>
+      <w:r>
+        <w:t>The API rechecks eligibility before execution. Discovery does not bypass code approval, enabled status, argument validation or human confirmation. AI-Assisted still requires execution confirmation when Review Input Args is unchecked.</w:t>
+      </w:r>
+    </w:p>
+    <w:p>
+      <w:pPr>
         <w:pStyle w:val="Heading1"/>
       </w:pPr>
       <w:r>

</xml_diff>